<commit_message>
Fix stray em dashes in GDD template/example/checklist docx files
House style uses no em dashes anywhere. Swapped for colons or commas in
headers, footers, and the sample banner text.

Co-Authored-By: Claude Sonnet 5 <noreply@anthropic.com>
Claude-Session: https://claude.ai/code/session_01GVbdkFEwJHJ64q8ctJPqEx
</commit_message>
<xml_diff>
--- a/robotics/robomaster_gdd_example.docx
+++ b/robotics/robomaster_gdd_example.docx
@@ -51,7 +51,7 @@
                 <w:sz w:val="20"/>
                 <w:szCs w:val="20"/>
               </w:rPr>
-              <w:t xml:space="preserve">Game Design Document — Worked Sample</w:t>
+              <w:t xml:space="preserve">Game Design Document · Worked Sample</w:t>
             </w:r>
           </w:p>
         </w:tc>
@@ -101,7 +101,7 @@
                 <w:sz w:val="21"/>
                 <w:szCs w:val="21"/>
               </w:rPr>
-              <w:t xml:space="preserve">SAMPLE — this is a fully worked example so you can see what “finished” looks like. Do not submit this game. Pick or invent your own; first crew to claim an idea keeps it.</w:t>
+              <w:t xml:space="preserve">SAMPLE: this is a fully worked example so you can see what “finished” looks like. Do not submit this game. Pick or invent your own; first crew to claim an idea keeps it.</w:t>
             </w:r>
           </w:p>
         </w:tc>
@@ -280,7 +280,7 @@
                 <w:sz w:val="20"/>
                 <w:szCs w:val="20"/>
               </w:rPr>
-              <w:t xml:space="preserve">High School — Comp Sci/Robotics 01T1</w:t>
+              <w:t xml:space="preserve">High School, Comp Sci/Robotics 01T1</w:t>
             </w:r>
           </w:p>
         </w:tc>
@@ -1622,7 +1622,7 @@
                 <w:sz w:val="24"/>
                 <w:szCs w:val="24"/>
               </w:rPr>
-              <w:t xml:space="preserve">Bonus — Field diagram</w:t>
+              <w:t xml:space="preserve">Bonus: Field diagram</w:t>
             </w:r>
           </w:p>
         </w:tc>
@@ -1715,7 +1715,7 @@
                 <w:sz w:val="24"/>
                 <w:szCs w:val="24"/>
               </w:rPr>
-              <w:t xml:space="preserve">Bonus — Program notes</w:t>
+              <w:t xml:space="preserve">Bonus: Program notes</w:t>
             </w:r>
           </w:p>
         </w:tc>
@@ -1835,7 +1835,7 @@
         <w:sz w:val="16"/>
         <w:szCs w:val="16"/>
       </w:rPr>
-      <w:t xml:space="preserve">Game Design Document — Worked Sample  ·  Mr. Krigger  ·  Good Hope Country Day School</w:t>
+      <w:t xml:space="preserve">Game Design Document, Worked Sample  ·  Mr. Krigger  ·  Good Hope Country Day School</w:t>
     </w:r>
   </w:p>
 </w:ftr>

</xml_diff>